<commit_message>
Update docs with verified end-to-end test against real Supabase database
</commit_message>
<xml_diff>
--- a/Formato de Proyecto 2026-02.docx
+++ b/Formato de Proyecto 2026-02.docx
@@ -2021,7 +2021,7 @@
               <w:rPr>
                 <w:b w:val="0"/>
               </w:rPr>
-              <w:t>No se trae ni se replica el esquema/datos a un contenedor local: no hay servicio de base de datos en el docker-compose. El contenedor del backend se conecta directamente al Postgres administrado de Supabase usando la cadena de conexion (host del pooler de Supabase), inyectada en tiempo de ejecucion como variable de entorno (ConnectionStrings__DefaultConnection)</w:t>
+              <w:t>No se trae ni se replica el esquema/datos a un contenedor local: no hay servicio de base de datos en el docker-compose. El contenedor del backend se conecta directamente al Postgres administrado de Supabase usando el Session Pooler (host aws-0-&lt;region&gt;.pooler.supabase.com, puerto 5432), inyectado en tiempo de ejecucion como variable de entorno (ConnectionStrings__DefaultConnection). Se probo tambien el host directo (IPv6-only, no resuelve en Docker Desktop/Windows) y el Transaction Pooler (puerto 6543), que causaba timeouts con Npgsql/EF Core en consultas reales; el Session Pooler fue el unico modo que funciono de forma estable</w:t>
             </w:r>
           </w:p>
         </w:tc>
@@ -3374,7 +3374,7 @@
               <w:rPr>
                 <w:b w:val="0"/>
               </w:rPr>
-              <w:t>Se levanto la pila completa con 'docker compose up --build'. El frontend respondio HTTP 200 en http://localhost:9200 (incluyendo el fallback de rutas de la SPA, ej. /dashboard, gracias a try_files en nginx.conf). Desde dentro del contenedor del frontend se alcanzo al backend por su nombre de servicio en la red interna de Compose ('docker compose exec frontend wget http://backend:8080/health'), confirmando que ambos contenedores se comunican correctamente en la misma red de Docker</w:t>
+              <w:t>Se levanto la pila completa con 'docker compose up --build' contra la base de datos real de Supabase. El backend respondio GET /health con 200 {status: ok, database: connected}. Se consulto un endpoint real con datos, GET /api/moneda, que devolvio las 29 monedas cargadas en la base. Se probo tambien POST /api/auth/login con credenciales inventadas, que respondio 401 'Credenciales invalidas', confirmando que el backend realmente consulta la tabla Usuarios en Supabase (no un mock). El frontend respondio HTTP 200 en http://localhost:9200 (incluido el fallback de rutas SPA), y desde dentro del contenedor del frontend se alcanzo al backend por su nombre de servicio en la red interna de Compose ('docker compose exec frontend wget http://backend:8080/api/moneda')</w:t>
             </w:r>
           </w:p>
         </w:tc>
@@ -3425,7 +3425,7 @@
               <w:rPr>
                 <w:b w:val="0"/>
               </w:rPr>
-              <w:t>Se detuvo el contenedor del backend ('docker compose stop backend') y el frontend siguio respondiendo HTTP 200 (sigue sirviendo el SPA estatico de forma independiente), aunque cualquier llamada a la API fallaria hasta que el backend vuelva. Al reiniciarlo ('docker compose start backend') el servicio volvio a responder con normalidad en pocos segundos, sin afectar al frontend. Nota: durante estas pruebas las credenciales de Supabase disponibles localmente estaban desactualizadas, por lo que /health devolvia 503 'database: disconnected' de forma consistente y controlada (sin tumbar el proceso ni el contenedor), lo que en si mismo demuestra que el manejo de errores de conexion funciona como se espera</w:t>
+              <w:t>Se detuvo el contenedor del backend ('docker compose stop backend') y el frontend siguio respondiendo HTTP 200 (sigue sirviendo el SPA estatico de forma independiente), aunque cualquier llamada a la API fallaria hasta que el backend vuelva. Al reiniciarlo ('docker compose start backend') el servicio volvio a responder con normalidad en pocos segundos, sin afectar al frontend. Por separado, tambien se verifico el caso de que la base de datos no este disponible (credenciales o pooler incorrectos): el endpoint /health responde 503 {status: error, database: disconnected} de forma controlada, sin tumbar el proceso ni el contenedor</w:t>
             </w:r>
           </w:p>
         </w:tc>
@@ -3657,7 +3657,7 @@
               <w:rPr>
                 <w:b w:val="0"/>
               </w:rPr>
-              <w:t>Las credenciales de Supabase guardadas localmente no permitieron conectar durante las pruebas (el pooler devolvia 'tenant/user not found' y el host directo no resolvia por DNS)</w:t>
+              <w:t>El host directo de Supabase (db.&lt;project-ref&gt;.supabase.co) no resolvia dentro de Docker Desktop/Windows, y luego, ya usando el pooler, las consultas reales (no el health check) se colgaban con timeout</w:t>
             </w:r>
           </w:p>
         </w:tc>
@@ -3677,7 +3677,7 @@
               <w:rPr>
                 <w:b w:val="0"/>
               </w:rPr>
-              <w:t>Se descarto que fuera un problema de Docker probando la misma conexion con psql fuera de los contenedores (mismo error). Se documento como pendiente de validar con credenciales vigentes de Supabase antes de la sustentacion; mientras tanto, el backend ya responde 503 de forma controlada en vez de caerse cuando la base de datos no esta disponible</w:t>
+              <w:t>Se identifico con nslookup que el host directo solo tiene registro IPv6 (Supabase lo hizo IPv6-only desde 2024) y Docker Desktop en Windows no tiene salida IPv6 por defecto. Cambiando al pooler de Supabase, el modo 'Transaction' (puerto 6543) daba timeouts en consultas reales por incompatibilidad conocida entre PgBouncer en modo transaction y Npgsql/EF Core; se resolvio usando el modo 'Session' del mismo pooler (puerto 5432), que funciona igual que una conexion directa y es compatible con Npgsql</w:t>
             </w:r>
           </w:p>
         </w:tc>
@@ -3986,7 +3986,7 @@
               <w:rPr>
                 <w:b w:val="0"/>
               </w:rPr>
-              <w:t>Necesita tener Docker Desktop instalado, clonar el repositorio de orquestacion con 'git clone --recurse-submodules', y conseguir del equipo la cadena de conexion real a Supabase (y opcionalmente las API keys de Brevo/Groq) para completar su propio archivo .env a partir de .env.example. Con eso, 'docker compose up --build' levanta todo. Pasos que siguen siendo manuales: obtener/rotar las credenciales de Supabase (no esta automatizado), y crear un usuario de prueba en la base de datos si se quiere probar el flujo de login sin usar una cuenta ya existente.</w:t>
+              <w:t>Necesita tener Docker Desktop instalado, clonar el repositorio de orquestacion con 'git clone --recurse-submodules', y conseguir del equipo la cadena de conexion del Session Pooler de Supabase (host aws-0-&lt;region&gt;.pooler.supabase.com, puerto 5432 -no 6543 ni el host directo-) para completar su propio archivo .env a partir de .env.example. Con eso, 'docker compose up --build' levanta todo y el flujo completo (mercado de monedas, login) funciona contra datos reales. Pasos que siguen siendo manuales: obtener/rotar las credenciales de Supabase (no esta automatizado), y conocer un usuario y contrasena validos si se quiere probar un login exitoso en vez de solo el rechazo por credenciales invalidas</w:t>
             </w:r>
           </w:p>
         </w:tc>

</xml_diff>